<commit_message>
[docs](client): 20+33주차 작업일지 업로드
</commit_message>
<xml_diff>
--- a/작업일지/졸업작품 작업일지 - 20+33주차.docx
+++ b/작업일지/졸업작품 작업일지 - 20+33주차.docx
@@ -223,7 +223,6 @@
                 <w:szCs w:val="18"/>
               </w:rPr>
             </w:pPr>
-            <w:proofErr w:type="gramStart"/>
             <w:r>
               <w:rPr>
                 <w:rFonts w:hint="eastAsia"/>
@@ -232,18 +231,7 @@
                 <w:sz w:val="18"/>
                 <w:szCs w:val="18"/>
               </w:rPr>
-              <w:t>( Outlander</w:t>
-            </w:r>
-            <w:proofErr w:type="gramEnd"/>
-            <w:r>
-              <w:rPr>
-                <w:rFonts w:hint="eastAsia"/>
-                <w:b/>
-                <w:bCs/>
-                <w:sz w:val="18"/>
-                <w:szCs w:val="18"/>
-              </w:rPr>
-              <w:t xml:space="preserve"> )</w:t>
+              <w:t>( Outlander )</w:t>
             </w:r>
           </w:p>
         </w:tc>
@@ -443,6 +431,7 @@
             <w:pPr>
               <w:jc w:val="left"/>
               <w:rPr>
+                <w:rFonts w:hint="eastAsia"/>
                 <w:b/>
               </w:rPr>
             </w:pPr>
@@ -458,7 +447,7 @@
                 <w:rFonts w:hint="eastAsia"/>
                 <w:b/>
               </w:rPr>
-              <w:t>거점 시스템 추가, 지형 레벨디자인 완료, 피격 애니메이션 미재생 버그 수정, 중력 버그 수정, 청크 스트리밍 구현, Zone 시스템 추가</w:t>
+              <w:t>맵에 나무 및 프랍 배치, 스킬 스크립트 제작</w:t>
             </w:r>
           </w:p>
           <w:p>
@@ -494,9 +483,6 @@
           <w:p>
             <w:pPr>
               <w:jc w:val="left"/>
-              <w:rPr>
-                <w:rFonts w:hint="eastAsia"/>
-              </w:rPr>
             </w:pPr>
             <w:r>
               <w:rPr>
@@ -579,7 +565,7 @@
           <w:rFonts w:hint="eastAsia"/>
           <w:sz w:val="22"/>
         </w:rPr>
-        <w:t>거점 시스템 추가</w:t>
+        <w:t>맵에 나무 및 프랍 배치</w:t>
       </w:r>
     </w:p>
     <w:p>
@@ -600,20 +586,7 @@
           <w:rFonts w:hint="eastAsia"/>
           <w:sz w:val="22"/>
         </w:rPr>
-        <w:t>거점 주위로 몬스터가 생성되고, 거점이 살아있는 동안은 계속 몬스터가 리스폰된다.</w:t>
-      </w:r>
-      <w:r>
-        <w:rPr>
-          <w:sz w:val="22"/>
-        </w:rPr>
-        <w:br/>
-      </w:r>
-      <w:r>
-        <w:rPr>
-          <w:rFonts w:hint="eastAsia"/>
-          <w:sz w:val="22"/>
-        </w:rPr>
-        <w:t>몬스터의 리스폰을 막으려면 거점을 깨야 한다.</w:t>
+        <w:t>Terrain Chunk에 브러쉬로 칠해서 만듦</w:t>
       </w:r>
     </w:p>
     <w:p>
@@ -634,7 +607,7 @@
           <w:rFonts w:hint="eastAsia"/>
           <w:sz w:val="22"/>
         </w:rPr>
-        <w:t>거점별로 체력, 생성되는 몬스터 종류와 최대 수, 스폰 반경, 활동 반경, 한 웨이브의 최대 몬스터 수, 몬스터 리스폰 시간, 거점 리스폰 시간 등을 정의해 사용</w:t>
+        <w:t>Terrain의 Detail Layer를 읽어 Detail Mesh들의 배치(Transform, Ground Align)를 파악한 후 추출</w:t>
       </w:r>
     </w:p>
     <w:p>
@@ -655,7 +628,76 @@
           <w:rFonts w:hint="eastAsia"/>
           <w:sz w:val="22"/>
         </w:rPr>
-        <w:t>현재 모델은 큐브 모양, 체력바는 노란색으로 렌더링, 모델은 에셋 구할 예정</w:t>
+        <w:t>임포트된 나무와 프랍은 Chunk 내부에 Static Object로 담겨 물리와 렌더링 처리</w:t>
+      </w:r>
+    </w:p>
+    <w:p>
+      <w:pPr>
+        <w:pStyle w:val="a3"/>
+        <w:numPr>
+          <w:ilvl w:val="2"/>
+          <w:numId w:val="1"/>
+        </w:numPr>
+        <w:ind w:leftChars="0"/>
+        <w:jc w:val="left"/>
+        <w:rPr>
+          <w:sz w:val="22"/>
+        </w:rPr>
+      </w:pPr>
+      <w:r>
+        <w:rPr>
+          <w:rFonts w:hint="eastAsia"/>
+          <w:sz w:val="22"/>
+        </w:rPr>
+        <w:t>충돌 처리를 위해 리소스별 BVH 제작하였으나 하직 PhysicSystem에 등록하지 않아</w:t>
+      </w:r>
+      <w:r>
+        <w:rPr>
+          <w:sz w:val="22"/>
+        </w:rPr>
+        <w:br/>
+      </w:r>
+      <w:r>
+        <w:rPr>
+          <w:rFonts w:hint="eastAsia"/>
+          <w:sz w:val="22"/>
+        </w:rPr>
+        <w:t>충돌 처리는 불가 (나무와 바위 등 관통)</w:t>
+      </w:r>
+    </w:p>
+    <w:p>
+      <w:pPr>
+        <w:pStyle w:val="a3"/>
+        <w:numPr>
+          <w:ilvl w:val="2"/>
+          <w:numId w:val="1"/>
+        </w:numPr>
+        <w:ind w:leftChars="0"/>
+        <w:jc w:val="left"/>
+        <w:rPr>
+          <w:rFonts w:hint="eastAsia"/>
+          <w:sz w:val="22"/>
+        </w:rPr>
+      </w:pPr>
+      <w:r>
+        <w:rPr>
+          <w:rFonts w:hint="eastAsia"/>
+          <w:sz w:val="22"/>
+        </w:rPr>
+        <w:t>나뭇잎, 풀 등의 객체를 대상으로 셰이더에서 alpha-test 수행하기 위해</w:t>
+      </w:r>
+      <w:r>
+        <w:rPr>
+          <w:sz w:val="22"/>
+        </w:rPr>
+        <w:br/>
+      </w:r>
+      <w:r>
+        <w:rPr>
+          <w:rFonts w:hint="eastAsia"/>
+          <w:sz w:val="22"/>
+        </w:rPr>
+        <w:t>대상 Material 구조체에 cAlphaCutoff 추가</w:t>
       </w:r>
     </w:p>
     <w:p>
@@ -676,7 +718,54 @@
           <w:rFonts w:hint="eastAsia"/>
           <w:sz w:val="22"/>
         </w:rPr>
-        <w:t>집단 전투 진입 시 주위 거점 파괴 여부로 생성되는 몬스터 수 변화, 스탯 변화 등 고려 예정</w:t>
+        <w:t>나뭇잎 색깔이 너무 어두운 경향이 있음, 셰이딩 버그인지 확인해야 함</w:t>
+      </w:r>
+    </w:p>
+    <w:p>
+      <w:pPr>
+        <w:pStyle w:val="a3"/>
+        <w:numPr>
+          <w:ilvl w:val="1"/>
+          <w:numId w:val="1"/>
+        </w:numPr>
+        <w:ind w:leftChars="0"/>
+        <w:jc w:val="left"/>
+        <w:rPr>
+          <w:sz w:val="22"/>
+        </w:rPr>
+      </w:pPr>
+      <w:r>
+        <w:rPr>
+          <w:rFonts w:hint="eastAsia"/>
+          <w:sz w:val="22"/>
+        </w:rPr>
+        <w:t>현재 나무와 프랍들을 모두 합하면 청크당 약 20,000 개의 인스턴스가 존재함,</w:t>
+      </w:r>
+      <w:r>
+        <w:rPr>
+          <w:sz w:val="22"/>
+        </w:rPr>
+        <w:br/>
+      </w:r>
+      <w:r>
+        <w:rPr>
+          <w:rFonts w:hint="eastAsia"/>
+          <w:sz w:val="22"/>
+        </w:rPr>
+        <w:t>기존의 컬링 기법들, deferred rendering, h/w instancing과 맞물려 FPS에 영향이 거의</w:t>
+      </w:r>
+      <w:r>
+        <w:rPr>
+          <w:sz w:val="22"/>
+        </w:rPr>
+        <w:br/>
+      </w:r>
+      <w:r>
+        <w:rPr>
+          <w:rFonts w:hint="eastAsia"/>
+          <w:sz w:val="22"/>
+        </w:rPr>
+        <w:t>없었음</w:t>
       </w:r>
     </w:p>
     <w:p>
@@ -697,7 +786,7 @@
           <w:rFonts w:hint="eastAsia"/>
           <w:sz w:val="22"/>
         </w:rPr>
-        <w:t>지형 레벨디자인 완료</w:t>
+        <w:t>스킬 스크립트 제작</w:t>
       </w:r>
     </w:p>
     <w:p>
@@ -718,7 +807,49 @@
           <w:rFonts w:hint="eastAsia"/>
           <w:sz w:val="22"/>
         </w:rPr>
-        <w:t>2D 레벨디자인 기반으로 유니티 Terrain Tool로 직접 브러쉬를 통해 그렸음.</w:t>
+        <w:t>클라이언트 standalone 스킬 모드를 완전히 스킬 에디터 툴로 변경</w:t>
+      </w:r>
+    </w:p>
+    <w:p>
+      <w:pPr>
+        <w:pStyle w:val="a3"/>
+        <w:numPr>
+          <w:ilvl w:val="2"/>
+          <w:numId w:val="1"/>
+        </w:numPr>
+        <w:ind w:leftChars="0"/>
+        <w:jc w:val="left"/>
+        <w:rPr>
+          <w:sz w:val="22"/>
+        </w:rPr>
+      </w:pPr>
+      <w:r>
+        <w:rPr>
+          <w:rFonts w:hint="eastAsia"/>
+          <w:sz w:val="22"/>
+        </w:rPr>
+        <w:t>GUI로 특정 스킬 플레이 및 편집 가능</w:t>
+      </w:r>
+    </w:p>
+    <w:p>
+      <w:pPr>
+        <w:pStyle w:val="a3"/>
+        <w:numPr>
+          <w:ilvl w:val="2"/>
+          <w:numId w:val="1"/>
+        </w:numPr>
+        <w:ind w:leftChars="0"/>
+        <w:jc w:val="left"/>
+        <w:rPr>
+          <w:sz w:val="22"/>
+        </w:rPr>
+      </w:pPr>
+      <w:r>
+        <w:rPr>
+          <w:rFonts w:hint="eastAsia"/>
+          <w:sz w:val="22"/>
+        </w:rPr>
+        <w:t>스킬의 히트박스를 클릭하면 마우스 피킹을 통해 선택되고,</w:t>
       </w:r>
       <w:r>
         <w:rPr>
@@ -731,14 +862,14 @@
           <w:rFonts w:hint="eastAsia"/>
           <w:sz w:val="22"/>
         </w:rPr>
-        <w:t>나무와 풀, 바위는 랜덤 배치 예정</w:t>
+        <w:t>생성 시점/소멸 시점/변환/부착 대상/히트 이벤트 등을 미세 조정할 수 있음</w:t>
       </w:r>
     </w:p>
     <w:p>
       <w:pPr>
         <w:pStyle w:val="a3"/>
         <w:numPr>
-          <w:ilvl w:val="1"/>
+          <w:ilvl w:val="2"/>
           <w:numId w:val="1"/>
         </w:numPr>
         <w:ind w:leftChars="0"/>
@@ -749,23 +880,16 @@
       </w:pPr>
       <w:r>
         <w:rPr>
-          <w:rFonts w:hint="eastAsia"/>
-          <w:sz w:val="22"/>
-        </w:rPr>
-        <w:t>인벤토리와 레어 무기 획득 등의 구현 가능 여부가 불투명함에 따라 아이템 획득처로</w:t>
-      </w:r>
-      <w:r>
-        <w:rPr>
-          <w:sz w:val="22"/>
-        </w:rPr>
-        <w:br/>
-      </w:r>
-      <w:r>
-        <w:rPr>
-          <w:rFonts w:hint="eastAsia"/>
-          <w:sz w:val="22"/>
-        </w:rPr>
-        <w:t>마련해놓은 사이드 경로는 폐기</w:t>
+          <w:sz w:val="22"/>
+        </w:rPr>
+        <w:t>C</w:t>
+      </w:r>
+      <w:r>
+        <w:rPr>
+          <w:rFonts w:hint="eastAsia"/>
+          <w:sz w:val="22"/>
+        </w:rPr>
+        <w:t>onfirm 시 조정된 값들을 스크립트에 덮어쓰기하여 반영</w:t>
       </w:r>
     </w:p>
     <w:p>
@@ -787,125 +911,499 @@
     </w:p>
     <w:p>
       <w:pPr>
-        <w:jc w:val="left"/>
-        <w:rPr>
-          <w:sz w:val="22"/>
-        </w:rPr>
-      </w:pPr>
-    </w:p>
-    <w:p>
-      <w:pPr>
         <w:pStyle w:val="a3"/>
-        <w:ind w:leftChars="0" w:left="1200"/>
-        <w:jc w:val="left"/>
-        <w:rPr>
-          <w:sz w:val="22"/>
-        </w:rPr>
-      </w:pPr>
-      <w:r>
-        <w:rPr>
-          <w:noProof/>
-          <w:sz w:val="24"/>
-          <w:szCs w:val="28"/>
-        </w:rPr>
-        <w:drawing>
-          <wp:inline distT="0" distB="0" distL="0" distR="0" wp14:anchorId="17294D92" wp14:editId="583D2786">
-            <wp:extent cx="5400000" cy="3178019"/>
-            <wp:effectExtent l="0" t="0" r="0" b="3810"/>
-            <wp:docPr id="274567447" name="그림 2" descr="도표, 그림, 종이접기, 디자인이(가) 표시된 사진&#10;&#10;자동 생성된 설명"/>
-            <wp:cNvGraphicFramePr>
-              <a:graphicFrameLocks xmlns:a="http://schemas.openxmlformats.org/drawingml/2006/main" noChangeAspect="1"/>
-            </wp:cNvGraphicFramePr>
-            <a:graphic xmlns:a="http://schemas.openxmlformats.org/drawingml/2006/main">
-              <a:graphicData uri="http://schemas.openxmlformats.org/drawingml/2006/picture">
-                <pic:pic xmlns:pic="http://schemas.openxmlformats.org/drawingml/2006/picture">
-                  <pic:nvPicPr>
-                    <pic:cNvPr id="274567447" name="그림 2" descr="도표, 그림, 종이접기, 디자인이(가) 표시된 사진&#10;&#10;자동 생성된 설명"/>
-                    <pic:cNvPicPr/>
-                  </pic:nvPicPr>
-                  <pic:blipFill>
-                    <a:blip r:embed="rId7" cstate="print">
-                      <a:extLst>
-                        <a:ext uri="{28A0092B-C50C-407E-A947-70E740481C1C}">
-                          <a14:useLocalDpi xmlns:a14="http://schemas.microsoft.com/office/drawing/2010/main" val="0"/>
-                        </a:ext>
-                      </a:extLst>
-                    </a:blip>
-                    <a:stretch>
-                      <a:fillRect/>
-                    </a:stretch>
-                  </pic:blipFill>
-                  <pic:spPr>
-                    <a:xfrm>
-                      <a:off x="0" y="0"/>
-                      <a:ext cx="5400000" cy="3178019"/>
-                    </a:xfrm>
-                    <a:prstGeom prst="rect">
-                      <a:avLst/>
-                    </a:prstGeom>
-                  </pic:spPr>
-                </pic:pic>
-              </a:graphicData>
-            </a:graphic>
-          </wp:inline>
-        </w:drawing>
-      </w:r>
-    </w:p>
-    <w:p>
-      <w:pPr>
-        <w:ind w:left="800"/>
-        <w:jc w:val="left"/>
-        <w:rPr>
-          <w:sz w:val="22"/>
-        </w:rPr>
-      </w:pPr>
-      <w:r>
-        <w:rPr>
-          <w:rFonts w:hint="eastAsia"/>
-          <w:noProof/>
-          <w:sz w:val="22"/>
-        </w:rPr>
-        <w:drawing>
-          <wp:inline distT="0" distB="0" distL="0" distR="0" wp14:anchorId="0A652999" wp14:editId="563A2CE7">
-            <wp:extent cx="5400000" cy="2907930"/>
-            <wp:effectExtent l="0" t="0" r="0" b="6985"/>
-            <wp:docPr id="2147336821" name="그림 1"/>
-            <wp:cNvGraphicFramePr>
-              <a:graphicFrameLocks xmlns:a="http://schemas.openxmlformats.org/drawingml/2006/main" noChangeAspect="1"/>
-            </wp:cNvGraphicFramePr>
-            <a:graphic xmlns:a="http://schemas.openxmlformats.org/drawingml/2006/main">
-              <a:graphicData uri="http://schemas.openxmlformats.org/drawingml/2006/picture">
-                <pic:pic xmlns:pic="http://schemas.openxmlformats.org/drawingml/2006/picture">
-                  <pic:nvPicPr>
-                    <pic:cNvPr id="2147336821" name="그림 2147336821"/>
-                    <pic:cNvPicPr/>
-                  </pic:nvPicPr>
-                  <pic:blipFill>
-                    <a:blip r:embed="rId8">
-                      <a:extLst>
-                        <a:ext uri="{28A0092B-C50C-407E-A947-70E740481C1C}">
-                          <a14:useLocalDpi xmlns:a14="http://schemas.microsoft.com/office/drawing/2010/main" val="0"/>
-                        </a:ext>
-                      </a:extLst>
-                    </a:blip>
-                    <a:stretch>
-                      <a:fillRect/>
-                    </a:stretch>
-                  </pic:blipFill>
-                  <pic:spPr>
-                    <a:xfrm>
-                      <a:off x="0" y="0"/>
-                      <a:ext cx="5400000" cy="2907930"/>
-                    </a:xfrm>
-                    <a:prstGeom prst="rect">
-                      <a:avLst/>
-                    </a:prstGeom>
-                  </pic:spPr>
-                </pic:pic>
-              </a:graphicData>
-            </a:graphic>
-          </wp:inline>
-        </w:drawing>
+        <w:numPr>
+          <w:ilvl w:val="1"/>
+          <w:numId w:val="1"/>
+        </w:numPr>
+        <w:ind w:leftChars="0"/>
+        <w:jc w:val="left"/>
+        <w:rPr>
+          <w:sz w:val="22"/>
+        </w:rPr>
+      </w:pPr>
+      <w:r>
+        <w:rPr>
+          <w:rFonts w:hint="eastAsia"/>
+          <w:sz w:val="22"/>
+        </w:rPr>
+        <w:lastRenderedPageBreak/>
+        <w:t>지면과 연계되는 스킬 구현</w:t>
+      </w:r>
+    </w:p>
+    <w:p>
+      <w:pPr>
+        <w:pStyle w:val="a3"/>
+        <w:numPr>
+          <w:ilvl w:val="2"/>
+          <w:numId w:val="1"/>
+        </w:numPr>
+        <w:ind w:leftChars="0"/>
+        <w:jc w:val="left"/>
+        <w:rPr>
+          <w:sz w:val="22"/>
+        </w:rPr>
+      </w:pPr>
+      <w:r>
+        <w:rPr>
+          <w:rFonts w:hint="eastAsia"/>
+          <w:sz w:val="22"/>
+        </w:rPr>
+        <w:t>땅에서 얼음 기둥이 솟아나는 스킬, 마법 구가 땅에 부딪혀 폭발하는 스킬 등</w:t>
+      </w:r>
+      <w:r>
+        <w:rPr>
+          <w:sz w:val="22"/>
+        </w:rPr>
+        <w:br/>
+      </w:r>
+      <w:r>
+        <w:rPr>
+          <w:rFonts w:hint="eastAsia"/>
+          <w:sz w:val="22"/>
+        </w:rPr>
+        <w:t>지면과의 상호작용이 필요한 스킬들이 있음</w:t>
+      </w:r>
+    </w:p>
+    <w:p>
+      <w:pPr>
+        <w:pStyle w:val="a3"/>
+        <w:numPr>
+          <w:ilvl w:val="2"/>
+          <w:numId w:val="1"/>
+        </w:numPr>
+        <w:ind w:leftChars="0"/>
+        <w:jc w:val="left"/>
+        <w:rPr>
+          <w:sz w:val="22"/>
+        </w:rPr>
+      </w:pPr>
+      <w:r>
+        <w:rPr>
+          <w:rFonts w:hint="eastAsia"/>
+          <w:sz w:val="22"/>
+        </w:rPr>
+        <w:t>VFX는 groundSnap, groundAlign, particleCollision, particleConform 속성 설정 가능</w:t>
+      </w:r>
+    </w:p>
+    <w:p>
+      <w:pPr>
+        <w:pStyle w:val="a3"/>
+        <w:numPr>
+          <w:ilvl w:val="3"/>
+          <w:numId w:val="1"/>
+        </w:numPr>
+        <w:ind w:leftChars="0"/>
+        <w:jc w:val="left"/>
+        <w:rPr>
+          <w:sz w:val="22"/>
+        </w:rPr>
+      </w:pPr>
+      <w:r>
+        <w:rPr>
+          <w:rFonts w:hint="eastAsia"/>
+          <w:sz w:val="22"/>
+        </w:rPr>
+        <w:t>groundSnap: VFX를 지표면 위로 강제로 투영</w:t>
+      </w:r>
+    </w:p>
+    <w:p>
+      <w:pPr>
+        <w:pStyle w:val="a3"/>
+        <w:numPr>
+          <w:ilvl w:val="3"/>
+          <w:numId w:val="1"/>
+        </w:numPr>
+        <w:ind w:leftChars="0"/>
+        <w:jc w:val="left"/>
+        <w:rPr>
+          <w:sz w:val="22"/>
+        </w:rPr>
+      </w:pPr>
+      <w:r>
+        <w:rPr>
+          <w:rFonts w:hint="eastAsia"/>
+          <w:sz w:val="22"/>
+        </w:rPr>
+        <w:t>groundAlign: VFX를 지면 노멀에 맞게 회전</w:t>
+      </w:r>
+    </w:p>
+    <w:p>
+      <w:pPr>
+        <w:pStyle w:val="a3"/>
+        <w:numPr>
+          <w:ilvl w:val="3"/>
+          <w:numId w:val="1"/>
+        </w:numPr>
+        <w:ind w:leftChars="0"/>
+        <w:jc w:val="left"/>
+        <w:rPr>
+          <w:sz w:val="22"/>
+        </w:rPr>
+      </w:pPr>
+      <w:r>
+        <w:rPr>
+          <w:rFonts w:hint="eastAsia"/>
+          <w:sz w:val="22"/>
+        </w:rPr>
+        <w:t>particleCollision: 파티클이 지면과 충돌할 시 처리 방식 지정,</w:t>
+      </w:r>
+      <w:r>
+        <w:rPr>
+          <w:sz w:val="22"/>
+        </w:rPr>
+        <w:br/>
+        <w:t>“</w:t>
+      </w:r>
+      <w:r>
+        <w:rPr>
+          <w:rFonts w:hint="eastAsia"/>
+          <w:sz w:val="22"/>
+        </w:rPr>
+        <w:t>GroundStop</w:t>
+      </w:r>
+      <w:r>
+        <w:rPr>
+          <w:sz w:val="22"/>
+        </w:rPr>
+        <w:t>”</w:t>
+      </w:r>
+      <w:r>
+        <w:rPr>
+          <w:rFonts w:hint="eastAsia"/>
+          <w:sz w:val="22"/>
+        </w:rPr>
+        <w:t>/</w:t>
+      </w:r>
+      <w:r>
+        <w:rPr>
+          <w:sz w:val="22"/>
+        </w:rPr>
+        <w:t>”</w:t>
+      </w:r>
+      <w:r>
+        <w:rPr>
+          <w:rFonts w:hint="eastAsia"/>
+          <w:sz w:val="22"/>
+        </w:rPr>
+        <w:t>GroundKill</w:t>
+      </w:r>
+      <w:r>
+        <w:rPr>
+          <w:sz w:val="22"/>
+        </w:rPr>
+        <w:t>”</w:t>
+      </w:r>
+      <w:r>
+        <w:rPr>
+          <w:rFonts w:hint="eastAsia"/>
+          <w:sz w:val="22"/>
+        </w:rPr>
+        <w:t>/</w:t>
+      </w:r>
+      <w:r>
+        <w:rPr>
+          <w:sz w:val="22"/>
+        </w:rPr>
+        <w:t>”</w:t>
+      </w:r>
+      <w:r>
+        <w:rPr>
+          <w:rFonts w:hint="eastAsia"/>
+          <w:sz w:val="22"/>
+        </w:rPr>
+        <w:t>GroundBounce</w:t>
+      </w:r>
+      <w:r>
+        <w:rPr>
+          <w:sz w:val="22"/>
+        </w:rPr>
+        <w:t>”</w:t>
+      </w:r>
+      <w:r>
+        <w:rPr>
+          <w:rFonts w:hint="eastAsia"/>
+          <w:sz w:val="22"/>
+        </w:rPr>
+        <w:t xml:space="preserve"> 중 하나의 값</w:t>
+      </w:r>
+    </w:p>
+    <w:p>
+      <w:pPr>
+        <w:pStyle w:val="a3"/>
+        <w:numPr>
+          <w:ilvl w:val="3"/>
+          <w:numId w:val="1"/>
+        </w:numPr>
+        <w:ind w:leftChars="0"/>
+        <w:jc w:val="left"/>
+        <w:rPr>
+          <w:sz w:val="22"/>
+        </w:rPr>
+      </w:pPr>
+      <w:r>
+        <w:rPr>
+          <w:rFonts w:hint="eastAsia"/>
+          <w:sz w:val="22"/>
+        </w:rPr>
+        <w:t>particleConform: 파티클이 지면과 겹쳐서 스폰될 시 처리 방식 지정,</w:t>
+      </w:r>
+      <w:r>
+        <w:rPr>
+          <w:sz w:val="22"/>
+        </w:rPr>
+        <w:br/>
+        <w:t>“</w:t>
+      </w:r>
+      <w:r>
+        <w:rPr>
+          <w:rFonts w:hint="eastAsia"/>
+          <w:sz w:val="22"/>
+        </w:rPr>
+        <w:t>SnapY</w:t>
+      </w:r>
+      <w:r>
+        <w:rPr>
+          <w:sz w:val="22"/>
+        </w:rPr>
+        <w:t>”</w:t>
+      </w:r>
+      <w:r>
+        <w:rPr>
+          <w:rFonts w:hint="eastAsia"/>
+          <w:sz w:val="22"/>
+        </w:rPr>
+        <w:t>/</w:t>
+      </w:r>
+      <w:r>
+        <w:rPr>
+          <w:sz w:val="22"/>
+        </w:rPr>
+        <w:t>”</w:t>
+      </w:r>
+      <w:r>
+        <w:rPr>
+          <w:rFonts w:hint="eastAsia"/>
+          <w:sz w:val="22"/>
+        </w:rPr>
+        <w:t>SnapAndAlign</w:t>
+      </w:r>
+      <w:r>
+        <w:rPr>
+          <w:sz w:val="22"/>
+        </w:rPr>
+        <w:t>”</w:t>
+      </w:r>
+      <w:r>
+        <w:rPr>
+          <w:rFonts w:hint="eastAsia"/>
+          <w:sz w:val="22"/>
+        </w:rPr>
+        <w:t xml:space="preserve"> 중 하나의 값</w:t>
+      </w:r>
+    </w:p>
+    <w:p>
+      <w:pPr>
+        <w:pStyle w:val="a3"/>
+        <w:numPr>
+          <w:ilvl w:val="2"/>
+          <w:numId w:val="1"/>
+        </w:numPr>
+        <w:ind w:leftChars="0"/>
+        <w:jc w:val="left"/>
+        <w:rPr>
+          <w:sz w:val="22"/>
+        </w:rPr>
+      </w:pPr>
+      <w:r>
+        <w:rPr>
+          <w:rFonts w:hint="eastAsia"/>
+          <w:sz w:val="22"/>
+        </w:rPr>
+        <w:t>Hitbox는 AttachType에 Ground 추가 (</w:t>
+      </w:r>
+      <w:r>
+        <w:rPr>
+          <w:sz w:val="22"/>
+        </w:rPr>
+        <w:t>“</w:t>
+      </w:r>
+      <w:r>
+        <w:rPr>
+          <w:rFonts w:hint="eastAsia"/>
+          <w:sz w:val="22"/>
+        </w:rPr>
+        <w:t>BoneAttach</w:t>
+      </w:r>
+      <w:r>
+        <w:rPr>
+          <w:sz w:val="22"/>
+        </w:rPr>
+        <w:t>”</w:t>
+      </w:r>
+      <w:r>
+        <w:rPr>
+          <w:rFonts w:hint="eastAsia"/>
+          <w:sz w:val="22"/>
+        </w:rPr>
+        <w:t>/</w:t>
+      </w:r>
+      <w:r>
+        <w:rPr>
+          <w:sz w:val="22"/>
+        </w:rPr>
+        <w:t>”</w:t>
+      </w:r>
+      <w:r>
+        <w:rPr>
+          <w:rFonts w:hint="eastAsia"/>
+          <w:sz w:val="22"/>
+        </w:rPr>
+        <w:t>VFXParticleAttach</w:t>
+      </w:r>
+      <w:r>
+        <w:rPr>
+          <w:sz w:val="22"/>
+        </w:rPr>
+        <w:t>”</w:t>
+      </w:r>
+      <w:r>
+        <w:rPr>
+          <w:rFonts w:hint="eastAsia"/>
+          <w:sz w:val="22"/>
+        </w:rPr>
+        <w:t>/</w:t>
+      </w:r>
+      <w:r>
+        <w:rPr>
+          <w:sz w:val="22"/>
+        </w:rPr>
+        <w:t>”</w:t>
+      </w:r>
+      <w:r>
+        <w:rPr>
+          <w:rFonts w:hint="eastAsia"/>
+          <w:sz w:val="22"/>
+        </w:rPr>
+        <w:t>GroundAttach</w:t>
+      </w:r>
+      <w:r>
+        <w:rPr>
+          <w:sz w:val="22"/>
+        </w:rPr>
+        <w:t>”</w:t>
+      </w:r>
+      <w:r>
+        <w:rPr>
+          <w:rFonts w:hint="eastAsia"/>
+          <w:sz w:val="22"/>
+        </w:rPr>
+        <w:t>)</w:t>
+      </w:r>
+      <w:r>
+        <w:rPr>
+          <w:rFonts w:hint="eastAsia"/>
+          <w:sz w:val="22"/>
+        </w:rPr>
+        <w:t>, anchor와 align 속성 설정 가능</w:t>
+      </w:r>
+    </w:p>
+    <w:p>
+      <w:pPr>
+        <w:pStyle w:val="a3"/>
+        <w:numPr>
+          <w:ilvl w:val="3"/>
+          <w:numId w:val="1"/>
+        </w:numPr>
+        <w:ind w:leftChars="0"/>
+        <w:jc w:val="left"/>
+        <w:rPr>
+          <w:sz w:val="22"/>
+        </w:rPr>
+      </w:pPr>
+      <w:r>
+        <w:rPr>
+          <w:rFonts w:hint="eastAsia"/>
+          <w:sz w:val="22"/>
+        </w:rPr>
+        <w:t>anchor: Hitbox가 특정 점 기준 local로 표현되어야 할 때 사용, 이때 anchor를</w:t>
+      </w:r>
+      <w:r>
+        <w:rPr>
+          <w:sz w:val="22"/>
+        </w:rPr>
+        <w:br/>
+      </w:r>
+      <w:r>
+        <w:rPr>
+          <w:rFonts w:hint="eastAsia"/>
+          <w:sz w:val="22"/>
+        </w:rPr>
+        <w:t>지표상 투영된 점으로 지정 가능</w:t>
+      </w:r>
+    </w:p>
+    <w:p>
+      <w:pPr>
+        <w:pStyle w:val="a3"/>
+        <w:numPr>
+          <w:ilvl w:val="3"/>
+          <w:numId w:val="1"/>
+        </w:numPr>
+        <w:ind w:leftChars="0"/>
+        <w:jc w:val="left"/>
+        <w:rPr>
+          <w:sz w:val="22"/>
+        </w:rPr>
+      </w:pPr>
+      <w:r>
+        <w:rPr>
+          <w:rFonts w:hint="eastAsia"/>
+          <w:sz w:val="22"/>
+        </w:rPr>
+        <w:t>align: Hitbox가 지면에 겹칠 경우 지면 노멀에 맞게 회전</w:t>
+      </w:r>
+    </w:p>
+    <w:p>
+      <w:pPr>
+        <w:pStyle w:val="a3"/>
+        <w:numPr>
+          <w:ilvl w:val="1"/>
+          <w:numId w:val="1"/>
+        </w:numPr>
+        <w:ind w:leftChars="0"/>
+        <w:jc w:val="left"/>
+        <w:rPr>
+          <w:sz w:val="22"/>
+        </w:rPr>
+      </w:pPr>
+      <w:r>
+        <w:rPr>
+          <w:rFonts w:hint="eastAsia"/>
+          <w:sz w:val="22"/>
+        </w:rPr>
+        <w:t>무기별 4종류 스킬 제작 완료</w:t>
+      </w:r>
+    </w:p>
+    <w:p>
+      <w:pPr>
+        <w:pStyle w:val="a3"/>
+        <w:numPr>
+          <w:ilvl w:val="2"/>
+          <w:numId w:val="1"/>
+        </w:numPr>
+        <w:ind w:leftChars="0"/>
+        <w:jc w:val="left"/>
+        <w:rPr>
+          <w:rFonts w:hint="eastAsia"/>
+          <w:sz w:val="22"/>
+        </w:rPr>
+      </w:pPr>
+      <w:r>
+        <w:rPr>
+          <w:rFonts w:hint="eastAsia"/>
+          <w:sz w:val="22"/>
+        </w:rPr>
+        <w:t>아직 온라인 모드 스킬 시스템에 등록되지 않음, 통합 필요</w:t>
       </w:r>
     </w:p>
     <w:p>
@@ -923,363 +1421,6 @@
       </w:pPr>
       <w:r>
         <w:rPr>
-          <w:rFonts w:hint="eastAsia"/>
-          <w:sz w:val="22"/>
-        </w:rPr>
-        <w:t>피격 애니메이션 미재생 버그 수정</w:t>
-      </w:r>
-    </w:p>
-    <w:p>
-      <w:pPr>
-        <w:pStyle w:val="a3"/>
-        <w:numPr>
-          <w:ilvl w:val="1"/>
-          <w:numId w:val="1"/>
-        </w:numPr>
-        <w:ind w:leftChars="0"/>
-        <w:jc w:val="left"/>
-        <w:rPr>
-          <w:sz w:val="22"/>
-        </w:rPr>
-      </w:pPr>
-      <w:r>
-        <w:rPr>
-          <w:rFonts w:hint="eastAsia"/>
-          <w:sz w:val="22"/>
-        </w:rPr>
-        <w:t>Skill System으로 인한 피격에는 피격 애니메이션을 재생하지 않고 있었음.</w:t>
-      </w:r>
-      <w:r>
-        <w:rPr>
-          <w:sz w:val="22"/>
-        </w:rPr>
-        <w:br/>
-      </w:r>
-      <w:r>
-        <w:rPr>
-          <w:rFonts w:hint="eastAsia"/>
-          <w:sz w:val="22"/>
-        </w:rPr>
-        <w:t>반응하도록 수정</w:t>
-      </w:r>
-    </w:p>
-    <w:p>
-      <w:pPr>
-        <w:pStyle w:val="a3"/>
-        <w:numPr>
-          <w:ilvl w:val="0"/>
-          <w:numId w:val="1"/>
-        </w:numPr>
-        <w:ind w:leftChars="0"/>
-        <w:jc w:val="left"/>
-        <w:rPr>
-          <w:sz w:val="22"/>
-        </w:rPr>
-      </w:pPr>
-      <w:r>
-        <w:rPr>
-          <w:rFonts w:hint="eastAsia"/>
-          <w:sz w:val="22"/>
-        </w:rPr>
-        <w:t>중력 버그 수정</w:t>
-      </w:r>
-    </w:p>
-    <w:p>
-      <w:pPr>
-        <w:pStyle w:val="a3"/>
-        <w:numPr>
-          <w:ilvl w:val="1"/>
-          <w:numId w:val="1"/>
-        </w:numPr>
-        <w:ind w:leftChars="0"/>
-        <w:jc w:val="left"/>
-        <w:rPr>
-          <w:sz w:val="22"/>
-        </w:rPr>
-      </w:pPr>
-      <w:r>
-        <w:rPr>
-          <w:sz w:val="22"/>
-        </w:rPr>
-        <w:t>S</w:t>
-      </w:r>
-      <w:r>
-        <w:rPr>
-          <w:rFonts w:hint="eastAsia"/>
-          <w:sz w:val="22"/>
-        </w:rPr>
-        <w:t>tandalone과 Online 모드의 코드 비통일 문제로, 예전에 물리가 덜 구현됐을 때 processInput에서 damping을 구현하던 게 남아있어 online game에선 이중으로 damping이 들어갔음. -&gt; 중력이 현저하게 낮아보이는 버그의 원인이 되었음</w:t>
-      </w:r>
-    </w:p>
-    <w:p>
-      <w:pPr>
-        <w:pStyle w:val="a3"/>
-        <w:numPr>
-          <w:ilvl w:val="1"/>
-          <w:numId w:val="1"/>
-        </w:numPr>
-        <w:ind w:leftChars="0"/>
-        <w:jc w:val="left"/>
-        <w:rPr>
-          <w:sz w:val="22"/>
-        </w:rPr>
-      </w:pPr>
-      <w:r>
-        <w:rPr>
-          <w:rFonts w:hint="eastAsia"/>
-          <w:sz w:val="22"/>
-        </w:rPr>
-        <w:t>Online 모드 processInput 최신화로 수정</w:t>
-      </w:r>
-    </w:p>
-    <w:p>
-      <w:pPr>
-        <w:widowControl/>
-        <w:wordWrap/>
-        <w:autoSpaceDE/>
-        <w:autoSpaceDN/>
-        <w:rPr>
-          <w:sz w:val="22"/>
-        </w:rPr>
-      </w:pPr>
-      <w:r>
-        <w:rPr>
-          <w:sz w:val="22"/>
-        </w:rPr>
-        <w:br w:type="page"/>
-      </w:r>
-    </w:p>
-    <w:p>
-      <w:pPr>
-        <w:pStyle w:val="a3"/>
-        <w:numPr>
-          <w:ilvl w:val="0"/>
-          <w:numId w:val="1"/>
-        </w:numPr>
-        <w:ind w:leftChars="0"/>
-        <w:jc w:val="left"/>
-        <w:rPr>
-          <w:sz w:val="22"/>
-        </w:rPr>
-      </w:pPr>
-      <w:r>
-        <w:rPr>
-          <w:rFonts w:hint="eastAsia"/>
-          <w:sz w:val="22"/>
-        </w:rPr>
-        <w:lastRenderedPageBreak/>
-        <w:t>청크 스트리밍 구현</w:t>
-      </w:r>
-    </w:p>
-    <w:p>
-      <w:pPr>
-        <w:pStyle w:val="a3"/>
-        <w:numPr>
-          <w:ilvl w:val="1"/>
-          <w:numId w:val="1"/>
-        </w:numPr>
-        <w:ind w:leftChars="0"/>
-        <w:jc w:val="left"/>
-        <w:rPr>
-          <w:sz w:val="22"/>
-        </w:rPr>
-      </w:pPr>
-      <w:r>
-        <w:rPr>
-          <w:rFonts w:hint="eastAsia"/>
-          <w:sz w:val="22"/>
-        </w:rPr>
-        <w:t>청크 사이즈는 200x200x200, 플레이어로부터 맨해튼 거리 3 이하의 chunk는 항상 로드되어있도록 하고, 그 외 chunk는 일정 시간의 유예를 두어 계속 플레이어 시야 바깥에 있을 경우 언로드하도록 구현</w:t>
-      </w:r>
-    </w:p>
-    <w:p>
-      <w:pPr>
-        <w:pStyle w:val="a3"/>
-        <w:numPr>
-          <w:ilvl w:val="2"/>
-          <w:numId w:val="1"/>
-        </w:numPr>
-        <w:ind w:leftChars="0"/>
-        <w:jc w:val="left"/>
-        <w:rPr>
-          <w:sz w:val="22"/>
-        </w:rPr>
-      </w:pPr>
-      <w:r>
-        <w:rPr>
-          <w:rFonts w:hint="eastAsia"/>
-          <w:sz w:val="22"/>
-        </w:rPr>
-        <w:t>청크 로딩 과정 중 Terrain Mesh를 cpu로 빌드하는 과정이 대부분의 시간을 차지</w:t>
-      </w:r>
-      <w:r>
-        <w:rPr>
-          <w:sz w:val="22"/>
-        </w:rPr>
-        <w:br/>
-      </w:r>
-      <w:r>
-        <w:rPr>
-          <w:rFonts w:hint="eastAsia"/>
-          <w:sz w:val="22"/>
-        </w:rPr>
-        <w:t>-&gt; 개별 청크의 Terrain Mesh 빌드를 스레드풀에 넘겨 멀티스레드로 로드</w:t>
-      </w:r>
-    </w:p>
-    <w:p>
-      <w:pPr>
-        <w:pStyle w:val="a3"/>
-        <w:numPr>
-          <w:ilvl w:val="2"/>
-          <w:numId w:val="1"/>
-        </w:numPr>
-        <w:ind w:leftChars="0"/>
-        <w:jc w:val="left"/>
-        <w:rPr>
-          <w:sz w:val="22"/>
-        </w:rPr>
-      </w:pPr>
-      <w:r>
-        <w:rPr>
-          <w:sz w:val="22"/>
-        </w:rPr>
-        <w:t>S</w:t>
-      </w:r>
-      <w:r>
-        <w:rPr>
-          <w:rFonts w:hint="eastAsia"/>
-          <w:sz w:val="22"/>
-        </w:rPr>
-        <w:t>eamless openworld인 셈?</w:t>
-      </w:r>
-    </w:p>
-    <w:p>
-      <w:pPr>
-        <w:pStyle w:val="a3"/>
-        <w:numPr>
-          <w:ilvl w:val="1"/>
-          <w:numId w:val="1"/>
-        </w:numPr>
-        <w:ind w:leftChars="0"/>
-        <w:jc w:val="left"/>
-        <w:rPr>
-          <w:sz w:val="22"/>
-        </w:rPr>
-      </w:pPr>
-      <w:r>
-        <w:rPr>
-          <w:rFonts w:hint="eastAsia"/>
-          <w:sz w:val="22"/>
-        </w:rPr>
-        <w:t>청크 구조와 플레이어의 시야 범위를 고려, 플레이어가 움직일 수 있는 범위보다 더 넓게 레벨을 디자</w:t>
-      </w:r>
-      <w:r>
-        <w:rPr>
-          <w:rFonts w:hint="eastAsia"/>
-          <w:sz w:val="22"/>
-        </w:rPr>
-        <w:t>인</w:t>
-      </w:r>
-    </w:p>
-    <w:p>
-      <w:pPr>
-        <w:pStyle w:val="a3"/>
-        <w:numPr>
-          <w:ilvl w:val="0"/>
-          <w:numId w:val="1"/>
-        </w:numPr>
-        <w:ind w:leftChars="0"/>
-        <w:jc w:val="left"/>
-        <w:rPr>
-          <w:sz w:val="22"/>
-        </w:rPr>
-      </w:pPr>
-      <w:r>
-        <w:rPr>
-          <w:rFonts w:hint="eastAsia"/>
-          <w:sz w:val="22"/>
-        </w:rPr>
-        <w:t>Zone 시스템 추가</w:t>
-      </w:r>
-    </w:p>
-    <w:p>
-      <w:pPr>
-        <w:pStyle w:val="a3"/>
-        <w:numPr>
-          <w:ilvl w:val="1"/>
-          <w:numId w:val="1"/>
-        </w:numPr>
-        <w:ind w:leftChars="0"/>
-        <w:jc w:val="left"/>
-        <w:rPr>
-          <w:sz w:val="22"/>
-        </w:rPr>
-      </w:pPr>
-      <w:r>
-        <w:rPr>
-          <w:rFonts w:hint="eastAsia"/>
-          <w:sz w:val="22"/>
-        </w:rPr>
-        <w:t>특정한 팩션의 객체가 수작업으로 만든 Bounding Volume 내로 진입하면 이벤트를 발생시킬 수 있는 시스템</w:t>
-      </w:r>
-    </w:p>
-    <w:p>
-      <w:pPr>
-        <w:pStyle w:val="a3"/>
-        <w:numPr>
-          <w:ilvl w:val="1"/>
-          <w:numId w:val="1"/>
-        </w:numPr>
-        <w:ind w:leftChars="0"/>
-        <w:jc w:val="left"/>
-        <w:rPr>
-          <w:sz w:val="22"/>
-        </w:rPr>
-      </w:pPr>
-      <w:r>
-        <w:rPr>
-          <w:rFonts w:hint="eastAsia"/>
-          <w:sz w:val="22"/>
-        </w:rPr>
-        <w:t>ZoneEnter, ZoneStay, ZoneLeave의 세 가지 이벤트로 나누어서 처리</w:t>
-      </w:r>
-    </w:p>
-    <w:p>
-      <w:pPr>
-        <w:pStyle w:val="a3"/>
-        <w:numPr>
-          <w:ilvl w:val="1"/>
-          <w:numId w:val="1"/>
-        </w:numPr>
-        <w:ind w:leftChars="0"/>
-        <w:jc w:val="left"/>
-        <w:rPr>
-          <w:sz w:val="22"/>
-        </w:rPr>
-      </w:pPr>
-      <w:r>
-        <w:rPr>
-          <w:rFonts w:hint="eastAsia"/>
-          <w:sz w:val="22"/>
-        </w:rPr>
-        <w:t>집단 전투 아레나에 ZoneEnter하게 되면, 중간 보스가 나타나고 가상의 벽이 세워져 지역을 벗어날 수 없게 될 예정 (현재 가상의 벽은 실제 구현 완료)</w:t>
-      </w:r>
-    </w:p>
-    <w:p>
-      <w:pPr>
-        <w:pStyle w:val="a3"/>
-        <w:numPr>
-          <w:ilvl w:val="0"/>
-          <w:numId w:val="1"/>
-        </w:numPr>
-        <w:ind w:leftChars="0"/>
-        <w:jc w:val="left"/>
-        <w:rPr>
-          <w:sz w:val="22"/>
-        </w:rPr>
-      </w:pPr>
-      <w:r>
-        <w:rPr>
           <w:sz w:val="22"/>
         </w:rPr>
         <w:br w:type="page"/>
@@ -1308,7 +1449,6 @@
         <w:ind w:leftChars="200" w:left="400"/>
         <w:jc w:val="left"/>
         <w:rPr>
-          <w:rFonts w:hint="eastAsia"/>
           <w:b/>
           <w:bCs/>
           <w:sz w:val="18"/>
@@ -1443,7 +1583,6 @@
         <w:ind w:left="1440"/>
         <w:jc w:val="left"/>
         <w:rPr>
-          <w:rFonts w:hint="eastAsia"/>
           <w:sz w:val="18"/>
           <w:szCs w:val="20"/>
         </w:rPr>
@@ -1471,7 +1610,7 @@
                     <pic:cNvPicPr/>
                   </pic:nvPicPr>
                   <pic:blipFill>
-                    <a:blip r:embed="rId9" cstate="print">
+                    <a:blip r:embed="rId7" cstate="print">
                       <a:extLst>
                         <a:ext uri="{28A0092B-C50C-407E-A947-70E740481C1C}">
                           <a14:useLocalDpi xmlns:a14="http://schemas.microsoft.com/office/drawing/2010/main" val="0"/>
@@ -1578,7 +1717,6 @@
         <w:ind w:leftChars="380" w:left="1120"/>
         <w:jc w:val="left"/>
         <w:rPr>
-          <w:rFonts w:hint="eastAsia"/>
           <w:sz w:val="18"/>
           <w:szCs w:val="20"/>
         </w:rPr>
@@ -1597,7 +1735,6 @@
         <w:ind w:leftChars="200" w:left="400"/>
         <w:jc w:val="left"/>
         <w:rPr>
-          <w:rFonts w:hint="eastAsia"/>
           <w:b/>
           <w:bCs/>
           <w:sz w:val="18"/>
@@ -1681,7 +1818,6 @@
         <w:ind w:leftChars="380" w:left="1120"/>
         <w:jc w:val="left"/>
         <w:rPr>
-          <w:rFonts w:hint="eastAsia"/>
           <w:sz w:val="18"/>
           <w:szCs w:val="20"/>
         </w:rPr>
@@ -1800,7 +1936,6 @@
         <w:ind w:leftChars="200" w:left="400"/>
         <w:jc w:val="left"/>
         <w:rPr>
-          <w:rFonts w:hint="eastAsia"/>
           <w:b/>
           <w:bCs/>
           <w:sz w:val="18"/>
@@ -1902,7 +2037,6 @@
         <w:ind w:leftChars="380" w:left="1120"/>
         <w:jc w:val="left"/>
         <w:rPr>
-          <w:rFonts w:hint="eastAsia"/>
           <w:sz w:val="18"/>
           <w:szCs w:val="20"/>
         </w:rPr>
@@ -2218,15 +2352,7 @@
         <w:br/>
       </w:r>
       <w:r>
-        <w:t>모든 참조가 사라지면 `</w:t>
-      </w:r>
-      <w:proofErr w:type="gramStart"/>
-      <w:r>
-        <w:t>ObjectPool::</w:t>
-      </w:r>
-      <w:proofErr w:type="gramEnd"/>
-      <w:r>
-        <w:t>makeShared`의 deleter를 통해 세션이 자동으로</w:t>
+        <w:t>모든 참조가 사라지면 `ObjectPool::makeShared`의 deleter를 통해 세션이 자동으로</w:t>
       </w:r>
       <w:r>
         <w:br/>
@@ -2648,7 +2774,34 @@
                 <w:bCs/>
                 <w:szCs w:val="20"/>
               </w:rPr>
-              <w:t>스킬 추가 구현 및 몬스터 패턴 구현, 레벨 디자인, 네비메시 추출</w:t>
+              <w:t xml:space="preserve">몬스터 패턴 구현, </w:t>
+            </w:r>
+            <w:r>
+              <w:rPr>
+                <w:rFonts w:hint="eastAsia"/>
+                <w:b/>
+                <w:bCs/>
+                <w:szCs w:val="20"/>
+              </w:rPr>
+              <w:t xml:space="preserve">나무/풀 그림자 포함 제대로 렌더링, Skill Cooldown UI 추가, </w:t>
+            </w:r>
+            <w:r>
+              <w:rPr>
+                <w:rFonts w:hint="eastAsia"/>
+                <w:b/>
+                <w:bCs/>
+                <w:szCs w:val="20"/>
+              </w:rPr>
+              <w:t>네비메시 추출</w:t>
+            </w:r>
+            <w:r>
+              <w:rPr>
+                <w:rFonts w:hint="eastAsia"/>
+                <w:b/>
+                <w:bCs/>
+                <w:szCs w:val="20"/>
+              </w:rPr>
+              <w:t>, 추가 몬스터 제작</w:t>
             </w:r>
             <w:r>
               <w:rPr>

</xml_diff>